<commit_message>
Finalizado Doc close #4
</commit_message>
<xml_diff>
--- a/Documento de login.docx
+++ b/Documento de login.docx
@@ -89,6 +89,67 @@
           <w:lang w:val="pt-BR"/>
         </w:rPr>
         <w:t>\</w:t>
+      </w:r>
+    </w:p>
+    <w:p>
+      <w:pPr>
+        <w:rPr>
+          <w:lang w:val="pt-BR"/>
+        </w:rPr>
+      </w:pPr>
+    </w:p>
+    <w:p>
+      <w:pPr>
+        <w:rPr>
+          <w:lang w:val="pt-BR"/>
+        </w:rPr>
+      </w:pPr>
+    </w:p>
+    <w:p>
+      <w:pPr>
+        <w:rPr>
+          <w:lang w:val="pt-BR"/>
+        </w:rPr>
+      </w:pPr>
+      <w:r>
+        <w:rPr>
+          <w:lang w:val="pt-BR"/>
+        </w:rPr>
+        <w:t>Finalizado documento de login</w:t>
+      </w:r>
+    </w:p>
+    <w:p>
+      <w:pPr>
+        <w:rPr>
+          <w:lang w:val="pt-BR"/>
+        </w:rPr>
+      </w:pPr>
+      <w:proofErr w:type="spellStart"/>
+      <w:r>
+        <w:rPr>
+          <w:lang w:val="pt-BR"/>
+        </w:rPr>
+        <w:t>By</w:t>
+      </w:r>
+      <w:proofErr w:type="spellEnd"/>
+      <w:r>
+        <w:rPr>
+          <w:lang w:val="pt-BR"/>
+        </w:rPr>
+        <w:t xml:space="preserve"> SLMM</w:t>
+      </w:r>
+    </w:p>
+    <w:p>
+      <w:pPr>
+        <w:rPr>
+          <w:lang w:val="pt-BR"/>
+        </w:rPr>
+      </w:pPr>
+      <w:r>
+        <w:rPr>
+          <w:lang w:val="pt-BR"/>
+        </w:rPr>
+        <w:t>20-03-2026</w:t>
       </w:r>
     </w:p>
     <w:p>

</xml_diff>